<commit_message>
update —— (2026-06-21 10:17:20)
</commit_message>
<xml_diff>
--- a/Debian_GNOME_Init/3/模板/DOCX-30行距.docx
+++ b/Debian_GNOME_Init/3/模板/DOCX-30行距.docx
@@ -2,6 +2,31 @@
 <file path=word/document.xml><?xml version="1.0" encoding="utf-8"?>
 <w:document xmlns:wpc="http://schemas.microsoft.com/office/word/2010/wordprocessingCanvas" xmlns:mc="http://schemas.openxmlformats.org/markup-compatibility/2006" xmlns:o="urn:schemas-microsoft-com:office:office" xmlns:r="http://schemas.openxmlformats.org/officeDocument/2006/relationships" xmlns:m="http://schemas.openxmlformats.org/officeDocument/2006/math" xmlns:v="urn:schemas-microsoft-com:vml" xmlns:wp14="http://schemas.microsoft.com/office/word/2010/wordprocessingDrawing" xmlns:wp="http://schemas.openxmlformats.org/drawingml/2006/wordprocessingDrawing" xmlns:w="http://schemas.openxmlformats.org/wordprocessingml/2006/main" xmlns:w14="http://schemas.microsoft.com/office/word/2010/wordml" xmlns:w10="urn:schemas-microsoft-com:office:word" xmlns:w15="http://schemas.microsoft.com/office/word/2012/wordml" xmlns:wpg="http://schemas.microsoft.com/office/word/2010/wordprocessingGroup" xmlns:wpi="http://schemas.microsoft.com/office/word/2010/wordprocessingInk" xmlns:wne="http://schemas.microsoft.com/office/word/2006/wordml" xmlns:wps="http://schemas.microsoft.com/office/word/2010/wordprocessingShape" xmlns:wpsCustomData="http://www.wps.cn/officeDocument/2013/wpsCustomData" mc:Ignorable="w14 w15 wp14">
   <w:body>
+    <w:p>
+      <w:pPr>
+        <w:bidi w:val="0"/>
+        <w:rPr>
+          <w:rFonts w:hint="default"/>
+          <w:lang w:val="en-US" w:eastAsia="zh-CN"/>
+        </w:rPr>
+      </w:pPr>
+      <w:bookmarkStart w:id="11" w:name="_GoBack"/>
+      <w:r>
+        <w:rPr>
+          <w:rFonts w:hint="eastAsia"/>
+          <w:lang w:val="en-US" w:eastAsia="zh-CN"/>
+        </w:rPr>
+        <w:t>正文</w:t>
+      </w:r>
+      <w:r>
+        <w:rPr>
+          <w:rFonts w:hint="default"/>
+          <w:lang w:val="en-US" w:eastAsia="zh-CN"/>
+        </w:rPr>
+        <w:t>GB2312</w:t>
+      </w:r>
+    </w:p>
+    <w:bookmarkEnd w:id="11"/>
     <w:p>
       <w:pPr>
         <w:pageBreakBefore w:val="0"/>
@@ -49,27 +74,28 @@
         <w:snapToGrid/>
         <w:textAlignment w:val="auto"/>
         <w:rPr>
+          <w:rFonts w:hint="eastAsia"/>
+          <w:lang w:val="en-US" w:eastAsia="zh-CN"/>
+        </w:rPr>
+      </w:pPr>
+      <w:r>
+        <w:rPr>
+          <w:rFonts w:hint="eastAsia"/>
+          <w:lang w:val="en-US" w:eastAsia="zh-CN"/>
+        </w:rPr>
+        <w:t>正文</w:t>
+      </w:r>
+      <w:r>
+        <w:rPr>
           <w:rFonts w:hint="default"/>
           <w:lang w:val="en-US" w:eastAsia="zh-CN"/>
         </w:rPr>
-      </w:pPr>
-      <w:r>
-        <w:rPr>
-          <w:rFonts w:hint="eastAsia"/>
-          <w:lang w:val="en-US" w:eastAsia="zh-CN"/>
-        </w:rPr>
-        <w:t>正文</w:t>
-      </w:r>
-      <w:r>
-        <w:rPr>
-          <w:rFonts w:hint="default"/>
-          <w:lang w:val="en-US" w:eastAsia="zh-CN"/>
-        </w:rPr>
         <w:t>GB2312</w:t>
       </w:r>
     </w:p>
     <w:p>
       <w:pPr>
+        <w:pStyle w:val="21"/>
         <w:pageBreakBefore w:val="0"/>
         <w:widowControl w:val="0"/>
         <w:kinsoku/>
@@ -82,28 +108,21 @@
         <w:snapToGrid/>
         <w:textAlignment w:val="auto"/>
         <w:rPr>
-          <w:rFonts w:hint="eastAsia"/>
-          <w:lang w:val="en-US" w:eastAsia="zh-CN"/>
-        </w:rPr>
-      </w:pPr>
-      <w:r>
-        <w:rPr>
-          <w:rFonts w:hint="eastAsia"/>
-          <w:lang w:val="en-US" w:eastAsia="zh-CN"/>
-        </w:rPr>
-        <w:t>正文</w:t>
-      </w:r>
-      <w:r>
-        <w:rPr>
           <w:rFonts w:hint="default"/>
           <w:lang w:val="en-US" w:eastAsia="zh-CN"/>
         </w:rPr>
-        <w:t>GB2312</w:t>
-      </w:r>
-    </w:p>
-    <w:p>
-      <w:pPr>
-        <w:pStyle w:val="23"/>
+      </w:pPr>
+      <w:r>
+        <w:rPr>
+          <w:rFonts w:hint="eastAsia"/>
+          <w:lang w:val="en-US" w:eastAsia="zh-CN"/>
+        </w:rPr>
+        <w:t>汇编方正小标宋</w:t>
+      </w:r>
+    </w:p>
+    <w:p>
+      <w:pPr>
+        <w:pStyle w:val="22"/>
         <w:pageBreakBefore w:val="0"/>
         <w:widowControl w:val="0"/>
         <w:kinsoku/>
@@ -116,42 +135,6 @@
         <w:snapToGrid/>
         <w:textAlignment w:val="auto"/>
         <w:rPr>
-          <w:rFonts w:hint="default"/>
-          <w:lang w:val="en-US" w:eastAsia="zh-CN"/>
-        </w:rPr>
-      </w:pPr>
-      <w:r>
-        <w:rPr>
-          <w:rFonts w:hint="eastAsia"/>
-          <w:lang w:val="en-US" w:eastAsia="zh-CN"/>
-        </w:rPr>
-        <w:t>汇编</w:t>
-      </w:r>
-      <w:bookmarkStart w:id="11" w:name="_GoBack"/>
-      <w:bookmarkEnd w:id="11"/>
-      <w:r>
-        <w:rPr>
-          <w:rFonts w:hint="eastAsia"/>
-          <w:lang w:val="en-US" w:eastAsia="zh-CN"/>
-        </w:rPr>
-        <w:t>方正小标宋</w:t>
-      </w:r>
-    </w:p>
-    <w:p>
-      <w:pPr>
-        <w:pStyle w:val="24"/>
-        <w:pageBreakBefore w:val="0"/>
-        <w:widowControl w:val="0"/>
-        <w:kinsoku/>
-        <w:overflowPunct/>
-        <w:topLinePunct w:val="0"/>
-        <w:autoSpaceDE/>
-        <w:autoSpaceDN/>
-        <w:bidi w:val="0"/>
-        <w:adjustRightInd/>
-        <w:snapToGrid/>
-        <w:textAlignment w:val="auto"/>
-        <w:rPr>
           <w:rFonts w:hint="eastAsia"/>
           <w:lang w:val="en-US" w:eastAsia="zh-CN"/>
         </w:rPr>
@@ -166,7 +149,7 @@
     </w:p>
     <w:p>
       <w:pPr>
-        <w:pStyle w:val="24"/>
+        <w:pStyle w:val="22"/>
         <w:pageBreakBefore w:val="0"/>
         <w:widowControl w:val="0"/>
         <w:kinsoku/>
@@ -304,8 +287,8 @@
           <w:lang w:val="en-US" w:eastAsia="zh-CN"/>
         </w:rPr>
       </w:pPr>
-      <w:bookmarkStart w:id="3" w:name="_Toc1206386538"/>
-      <w:bookmarkStart w:id="4" w:name="_Toc188993031"/>
+      <w:bookmarkStart w:id="3" w:name="_Toc188993031"/>
+      <w:bookmarkStart w:id="4" w:name="_Toc1206386538"/>
       <w:bookmarkStart w:id="5" w:name="_Toc1137365203"/>
       <w:bookmarkStart w:id="6" w:name="_Toc1946097949"/>
       <w:r>
@@ -487,7 +470,7 @@
     </w:p>
     <w:p>
       <w:pPr>
-        <w:pStyle w:val="19"/>
+        <w:pStyle w:val="17"/>
         <w:pageBreakBefore w:val="0"/>
         <w:widowControl w:val="0"/>
         <w:kinsoku/>
@@ -508,7 +491,7 @@
     </w:p>
     <w:p>
       <w:pPr>
-        <w:pStyle w:val="34"/>
+        <w:pStyle w:val="30"/>
         <w:pageBreakBefore w:val="0"/>
         <w:widowControl w:val="0"/>
         <w:kinsoku/>
@@ -535,7 +518,7 @@
     </w:p>
     <w:p>
       <w:pPr>
-        <w:pStyle w:val="35"/>
+        <w:pStyle w:val="31"/>
         <w:pageBreakBefore w:val="0"/>
         <w:widowControl w:val="0"/>
         <w:kinsoku/>
@@ -695,7 +678,7 @@
 <w:ftr xmlns:wpc="http://schemas.microsoft.com/office/word/2010/wordprocessingCanvas" xmlns:mc="http://schemas.openxmlformats.org/markup-compatibility/2006" xmlns:o="urn:schemas-microsoft-com:office:office" xmlns:r="http://schemas.openxmlformats.org/officeDocument/2006/relationships" xmlns:m="http://schemas.openxmlformats.org/officeDocument/2006/math" xmlns:v="urn:schemas-microsoft-com:vml" xmlns:wp14="http://schemas.microsoft.com/office/word/2010/wordprocessingDrawing" xmlns:wp="http://schemas.openxmlformats.org/drawingml/2006/wordprocessingDrawing" xmlns:w10="urn:schemas-microsoft-com:office:word" xmlns:w="http://schemas.openxmlformats.org/wordprocessingml/2006/main" xmlns:w14="http://schemas.microsoft.com/office/word/2010/wordml" xmlns:w15="http://schemas.microsoft.com/office/word/2012/wordml" xmlns:wpg="http://schemas.microsoft.com/office/word/2010/wordprocessingGroup" xmlns:wpi="http://schemas.microsoft.com/office/word/2010/wordprocessingInk" xmlns:wne="http://schemas.microsoft.com/office/word/2006/wordml" xmlns:wps="http://schemas.microsoft.com/office/word/2010/wordprocessingShape" xmlns:wpsCustomData="http://www.wps.cn/officeDocument/2013/wpsCustomData" mc:Ignorable="w14 w15 wp14">
   <w:p>
     <w:pPr>
-      <w:pStyle w:val="15"/>
+      <w:pStyle w:val="13"/>
     </w:pPr>
     <w:r>
       <w:rPr>
@@ -752,7 +735,7 @@
                       <w:txbxContent>
                         <w:p>
                           <w:pPr>
-                            <w:pStyle w:val="15"/>
+                            <w:pStyle w:val="13"/>
                           </w:pPr>
                           <w:r>
                             <w:rPr>
@@ -817,7 +800,7 @@
                 <w:txbxContent>
                   <w:p>
                     <w:pPr>
-                      <w:pStyle w:val="15"/>
+                      <w:pStyle w:val="13"/>
                     </w:pPr>
                     <w:r>
                       <w:rPr>
@@ -973,8 +956,8 @@
     <w:lsdException w:uiPriority="99" w:name="Closing"/>
     <w:lsdException w:uiPriority="99" w:name="Signature"/>
     <w:lsdException w:qFormat="1" w:uiPriority="1" w:semiHidden="0" w:name="Default Paragraph Font"/>
-    <w:lsdException w:qFormat="1" w:uiPriority="0" w:semiHidden="0" w:name="Body Text"/>
-    <w:lsdException w:qFormat="1" w:uiPriority="99" w:semiHidden="0" w:name="Body Text Indent"/>
+    <w:lsdException w:unhideWhenUsed="0" w:uiPriority="0" w:semiHidden="0" w:name="Body Text"/>
+    <w:lsdException w:unhideWhenUsed="0" w:uiPriority="0" w:semiHidden="0" w:name="Body Text Indent"/>
     <w:lsdException w:uiPriority="99" w:name="List Continue"/>
     <w:lsdException w:uiPriority="99" w:name="List Continue 2"/>
     <w:lsdException w:uiPriority="99" w:name="List Continue 3"/>
@@ -1293,7 +1276,7 @@
     <w:name w:val="heading 7"/>
     <w:basedOn w:val="1"/>
     <w:next w:val="1"/>
-    <w:link w:val="33"/>
+    <w:link w:val="29"/>
     <w:unhideWhenUsed/>
     <w:qFormat/>
     <w:uiPriority w:val="9"/>
@@ -1308,7 +1291,7 @@
       <w:sz w:val="24"/>
     </w:rPr>
   </w:style>
-  <w:style w:type="character" w:default="1" w:styleId="22">
+  <w:style w:type="character" w:default="1" w:styleId="20">
     <w:name w:val="Default Paragraph Font"/>
     <w:unhideWhenUsed/>
     <w:qFormat/>
@@ -1319,7 +1302,7 @@
       <w:szCs w:val="32"/>
     </w:rPr>
   </w:style>
-  <w:style w:type="table" w:default="1" w:styleId="20">
+  <w:style w:type="table" w:default="1" w:styleId="18">
     <w:name w:val="Normal Table"/>
     <w:semiHidden/>
     <w:unhideWhenUsed/>
@@ -1349,40 +1332,6 @@
     </w:rPr>
   </w:style>
   <w:style w:type="paragraph" w:styleId="10">
-    <w:name w:val="Body Text"/>
-    <w:basedOn w:val="1"/>
-    <w:link w:val="30"/>
-    <w:unhideWhenUsed/>
-    <w:qFormat/>
-    <w:uiPriority w:val="0"/>
-    <w:pPr>
-      <w:tabs>
-        <w:tab w:val="left" w:pos="6400"/>
-      </w:tabs>
-      <w:snapToGrid w:val="0"/>
-      <w:spacing w:line="600" w:lineRule="exact"/>
-      <w:jc w:val="left"/>
-    </w:pPr>
-    <w:rPr>
-      <w:rFonts w:ascii="仿宋_GB2312" w:hAnsi="仿宋_GB2312" w:eastAsia="仿宋_GB2312" w:cs="Times New Roman"/>
-      <w:szCs w:val="24"/>
-    </w:rPr>
-  </w:style>
-  <w:style w:type="paragraph" w:styleId="11">
-    <w:name w:val="Body Text Indent"/>
-    <w:basedOn w:val="1"/>
-    <w:link w:val="28"/>
-    <w:unhideWhenUsed/>
-    <w:qFormat/>
-    <w:uiPriority w:val="99"/>
-    <w:pPr>
-      <w:ind w:left="640" w:leftChars="200"/>
-    </w:pPr>
-    <w:rPr>
-      <w:rFonts w:ascii="仿宋_GB2312" w:hAnsi="仿宋_GB2312" w:eastAsia="仿宋_GB2312"/>
-    </w:rPr>
-  </w:style>
-  <w:style w:type="paragraph" w:styleId="12">
     <w:name w:val="toc 3"/>
     <w:basedOn w:val="1"/>
     <w:next w:val="1"/>
@@ -1397,11 +1346,11 @@
       <w:rFonts w:ascii="仿宋_GB2312" w:hAnsi="仿宋_GB2312" w:eastAsia="仿宋_GB2312"/>
     </w:rPr>
   </w:style>
-  <w:style w:type="paragraph" w:styleId="13">
+  <w:style w:type="paragraph" w:styleId="11">
     <w:name w:val="Date"/>
     <w:basedOn w:val="1"/>
     <w:next w:val="1"/>
-    <w:link w:val="31"/>
+    <w:link w:val="27"/>
     <w:semiHidden/>
     <w:unhideWhenUsed/>
     <w:qFormat/>
@@ -1411,10 +1360,10 @@
       <w:szCs w:val="24"/>
     </w:rPr>
   </w:style>
-  <w:style w:type="paragraph" w:styleId="14">
+  <w:style w:type="paragraph" w:styleId="12">
     <w:name w:val="Balloon Text"/>
     <w:basedOn w:val="1"/>
-    <w:link w:val="32"/>
+    <w:link w:val="28"/>
     <w:semiHidden/>
     <w:unhideWhenUsed/>
     <w:qFormat/>
@@ -1425,10 +1374,10 @@
       <w:szCs w:val="18"/>
     </w:rPr>
   </w:style>
-  <w:style w:type="paragraph" w:styleId="15">
+  <w:style w:type="paragraph" w:styleId="13">
     <w:name w:val="footer"/>
     <w:basedOn w:val="1"/>
-    <w:link w:val="27"/>
+    <w:link w:val="25"/>
     <w:unhideWhenUsed/>
     <w:qFormat/>
     <w:uiPriority w:val="0"/>
@@ -1447,10 +1396,10 @@
       <w:szCs w:val="18"/>
     </w:rPr>
   </w:style>
-  <w:style w:type="paragraph" w:styleId="16">
+  <w:style w:type="paragraph" w:styleId="14">
     <w:name w:val="header"/>
     <w:basedOn w:val="1"/>
-    <w:link w:val="26"/>
+    <w:link w:val="24"/>
     <w:unhideWhenUsed/>
     <w:qFormat/>
     <w:uiPriority w:val="0"/>
@@ -1471,7 +1420,7 @@
       <w:szCs w:val="18"/>
     </w:rPr>
   </w:style>
-  <w:style w:type="paragraph" w:styleId="17">
+  <w:style w:type="paragraph" w:styleId="15">
     <w:name w:val="toc 1"/>
     <w:basedOn w:val="1"/>
     <w:next w:val="1"/>
@@ -1485,7 +1434,7 @@
       <w:rFonts w:ascii="仿宋_GB2312" w:hAnsi="仿宋_GB2312" w:eastAsia="仿宋_GB2312"/>
     </w:rPr>
   </w:style>
-  <w:style w:type="paragraph" w:styleId="18">
+  <w:style w:type="paragraph" w:styleId="16">
     <w:name w:val="toc 2"/>
     <w:basedOn w:val="1"/>
     <w:next w:val="1"/>
@@ -1497,10 +1446,9 @@
       <w:ind w:left="0" w:leftChars="200"/>
     </w:pPr>
   </w:style>
-  <w:style w:type="paragraph" w:styleId="19">
+  <w:style w:type="paragraph" w:styleId="17">
     <w:name w:val="Body Text First Indent 2"/>
-    <w:basedOn w:val="11"/>
-    <w:link w:val="29"/>
+    <w:link w:val="26"/>
     <w:qFormat/>
     <w:uiPriority w:val="99"/>
     <w:pPr>
@@ -1511,9 +1459,9 @@
       <w:szCs w:val="21"/>
     </w:rPr>
   </w:style>
-  <w:style w:type="table" w:styleId="21">
+  <w:style w:type="table" w:styleId="19">
     <w:name w:val="Table Grid"/>
-    <w:basedOn w:val="20"/>
+    <w:basedOn w:val="18"/>
     <w:qFormat/>
     <w:uiPriority w:val="0"/>
     <w:pPr>
@@ -1543,7 +1491,7 @@
       </w:tblCellMar>
     </w:tblPr>
   </w:style>
-  <w:style w:type="paragraph" w:customStyle="1" w:styleId="23">
+  <w:style w:type="paragraph" w:customStyle="1" w:styleId="21">
     <w:name w:val="0-大标题-方正小标宋"/>
     <w:basedOn w:val="1"/>
     <w:next w:val="1"/>
@@ -1561,11 +1509,11 @@
       <w:szCs w:val="44"/>
     </w:rPr>
   </w:style>
-  <w:style w:type="paragraph" w:customStyle="1" w:styleId="24">
+  <w:style w:type="paragraph" w:customStyle="1" w:styleId="22">
     <w:name w:val="0-署名和日期-楷体GB2312"/>
     <w:basedOn w:val="1"/>
     <w:next w:val="1"/>
-    <w:link w:val="25"/>
+    <w:link w:val="23"/>
     <w:qFormat/>
     <w:uiPriority w:val="0"/>
     <w:pPr>
@@ -1580,9 +1528,9 @@
       <w:szCs w:val="32"/>
     </w:rPr>
   </w:style>
-  <w:style w:type="character" w:customStyle="1" w:styleId="25">
+  <w:style w:type="character" w:customStyle="1" w:styleId="23">
     <w:name w:val="0-署名和日期 Char"/>
-    <w:link w:val="24"/>
+    <w:link w:val="22"/>
     <w:qFormat/>
     <w:uiPriority w:val="0"/>
     <w:rPr>
@@ -1594,10 +1542,10 @@
       <w:szCs w:val="32"/>
     </w:rPr>
   </w:style>
-  <w:style w:type="character" w:customStyle="1" w:styleId="26">
+  <w:style w:type="character" w:customStyle="1" w:styleId="24">
     <w:name w:val="页眉 Char"/>
-    <w:basedOn w:val="22"/>
-    <w:link w:val="16"/>
+    <w:basedOn w:val="20"/>
+    <w:link w:val="14"/>
     <w:qFormat/>
     <w:uiPriority w:val="0"/>
     <w:rPr>
@@ -1606,10 +1554,10 @@
       <w:szCs w:val="18"/>
     </w:rPr>
   </w:style>
-  <w:style w:type="character" w:customStyle="1" w:styleId="27">
+  <w:style w:type="character" w:customStyle="1" w:styleId="25">
     <w:name w:val="页脚 Char"/>
-    <w:basedOn w:val="22"/>
-    <w:link w:val="15"/>
+    <w:basedOn w:val="20"/>
+    <w:link w:val="13"/>
     <w:qFormat/>
     <w:uiPriority w:val="0"/>
     <w:rPr>
@@ -1618,21 +1566,9 @@
       <w:szCs w:val="18"/>
     </w:rPr>
   </w:style>
-  <w:style w:type="character" w:customStyle="1" w:styleId="28">
-    <w:name w:val="正文文本缩进 Char"/>
-    <w:basedOn w:val="22"/>
-    <w:link w:val="11"/>
-    <w:semiHidden/>
-    <w:qFormat/>
-    <w:uiPriority w:val="99"/>
-    <w:rPr>
-      <w:rFonts w:ascii="仿宋_GB2312" w:hAnsi="仿宋_GB2312" w:eastAsia="仿宋_GB2312"/>
-    </w:rPr>
-  </w:style>
-  <w:style w:type="character" w:customStyle="1" w:styleId="29">
+  <w:style w:type="character" w:customStyle="1" w:styleId="26">
     <w:name w:val="正文首行缩进 2 Char"/>
-    <w:basedOn w:val="28"/>
-    <w:link w:val="19"/>
+    <w:link w:val="17"/>
     <w:qFormat/>
     <w:uiPriority w:val="99"/>
     <w:rPr>
@@ -1640,10 +1576,10 @@
       <w:szCs w:val="21"/>
     </w:rPr>
   </w:style>
-  <w:style w:type="character" w:customStyle="1" w:styleId="30">
-    <w:name w:val="正文文本 Char"/>
-    <w:basedOn w:val="22"/>
-    <w:link w:val="10"/>
+  <w:style w:type="character" w:customStyle="1" w:styleId="27">
+    <w:name w:val="日期 Char"/>
+    <w:basedOn w:val="20"/>
+    <w:link w:val="11"/>
     <w:semiHidden/>
     <w:qFormat/>
     <w:uiPriority w:val="0"/>
@@ -1653,23 +1589,10 @@
       <w:szCs w:val="24"/>
     </w:rPr>
   </w:style>
-  <w:style w:type="character" w:customStyle="1" w:styleId="31">
-    <w:name w:val="日期 Char"/>
-    <w:basedOn w:val="22"/>
-    <w:link w:val="13"/>
-    <w:semiHidden/>
-    <w:qFormat/>
-    <w:uiPriority w:val="0"/>
-    <w:rPr>
-      <w:rFonts w:ascii="仿宋_GB2312" w:hAnsi="仿宋_GB2312" w:eastAsia="仿宋_GB2312" w:cs="Times New Roman"/>
-      <w:sz w:val="32"/>
-      <w:szCs w:val="24"/>
-    </w:rPr>
-  </w:style>
-  <w:style w:type="character" w:customStyle="1" w:styleId="32">
+  <w:style w:type="character" w:customStyle="1" w:styleId="28">
     <w:name w:val="批注框文本 Char"/>
-    <w:basedOn w:val="22"/>
-    <w:link w:val="14"/>
+    <w:basedOn w:val="20"/>
+    <w:link w:val="12"/>
     <w:semiHidden/>
     <w:qFormat/>
     <w:uiPriority w:val="0"/>
@@ -1679,7 +1602,7 @@
       <w:szCs w:val="18"/>
     </w:rPr>
   </w:style>
-  <w:style w:type="character" w:customStyle="1" w:styleId="33">
+  <w:style w:type="character" w:customStyle="1" w:styleId="29">
     <w:name w:val="标题 7 Char"/>
     <w:link w:val="8"/>
     <w:qFormat/>
@@ -1689,7 +1612,7 @@
       <w:sz w:val="24"/>
     </w:rPr>
   </w:style>
-  <w:style w:type="paragraph" w:customStyle="1" w:styleId="34">
+  <w:style w:type="paragraph" w:customStyle="1" w:styleId="30">
     <w:name w:val="落款"/>
     <w:basedOn w:val="1"/>
     <w:next w:val="1"/>
@@ -1704,10 +1627,11 @@
       <w:szCs w:val="32"/>
     </w:rPr>
   </w:style>
-  <w:style w:type="paragraph" w:customStyle="1" w:styleId="35">
+  <w:style w:type="paragraph" w:customStyle="1" w:styleId="31">
     <w:name w:val="落款时间"/>
     <w:basedOn w:val="1"/>
     <w:next w:val="1"/>
+    <w:qFormat/>
     <w:uiPriority w:val="0"/>
     <w:pPr>
       <w:wordWrap w:val="0"/>

</xml_diff>

<commit_message>
update —— (2026-06-21 10:19:45)
</commit_message>
<xml_diff>
--- a/Debian_GNOME_Init/3/模板/DOCX-30行距.docx
+++ b/Debian_GNOME_Init/3/模板/DOCX-30行距.docx
@@ -10,7 +10,6 @@
           <w:lang w:val="en-US" w:eastAsia="zh-CN"/>
         </w:rPr>
       </w:pPr>
-      <w:bookmarkStart w:id="11" w:name="_GoBack"/>
       <w:r>
         <w:rPr>
           <w:rFonts w:hint="eastAsia"/>
@@ -26,7 +25,6 @@
         <w:t>GB2312</w:t>
       </w:r>
     </w:p>
-    <w:bookmarkEnd w:id="11"/>
     <w:p>
       <w:pPr>
         <w:pageBreakBefore w:val="0"/>
@@ -59,6 +57,8 @@
         </w:rPr>
         <w:t>GB2312</w:t>
       </w:r>
+      <w:bookmarkStart w:id="11" w:name="_GoBack"/>
+      <w:bookmarkEnd w:id="11"/>
     </w:p>
     <w:p>
       <w:pPr>
@@ -227,9 +227,9 @@
           <w:lang w:val="en-US" w:eastAsia="zh-CN"/>
         </w:rPr>
       </w:pPr>
-      <w:bookmarkStart w:id="0" w:name="_Toc123187978"/>
-      <w:bookmarkStart w:id="1" w:name="_Toc2057989189"/>
-      <w:bookmarkStart w:id="2" w:name="_Toc729529132"/>
+      <w:bookmarkStart w:id="0" w:name="_Toc729529132"/>
+      <w:bookmarkStart w:id="1" w:name="_Toc123187978"/>
+      <w:bookmarkStart w:id="2" w:name="_Toc2057989189"/>
       <w:r>
         <w:rPr>
           <w:rFonts w:hint="eastAsia"/>
@@ -287,10 +287,10 @@
           <w:lang w:val="en-US" w:eastAsia="zh-CN"/>
         </w:rPr>
       </w:pPr>
-      <w:bookmarkStart w:id="3" w:name="_Toc188993031"/>
-      <w:bookmarkStart w:id="4" w:name="_Toc1206386538"/>
-      <w:bookmarkStart w:id="5" w:name="_Toc1137365203"/>
-      <w:bookmarkStart w:id="6" w:name="_Toc1946097949"/>
+      <w:bookmarkStart w:id="3" w:name="_Toc1946097949"/>
+      <w:bookmarkStart w:id="4" w:name="_Toc1137365203"/>
+      <w:bookmarkStart w:id="5" w:name="_Toc188993031"/>
+      <w:bookmarkStart w:id="6" w:name="_Toc1206386538"/>
       <w:r>
         <w:rPr>
           <w:rFonts w:hint="eastAsia"/>
@@ -347,8 +347,8 @@
       </w:pPr>
       <w:bookmarkStart w:id="7" w:name="_Toc1298874793"/>
       <w:bookmarkStart w:id="8" w:name="_Toc12900356"/>
-      <w:bookmarkStart w:id="9" w:name="_Toc182799226"/>
-      <w:bookmarkStart w:id="10" w:name="_Toc1270592752"/>
+      <w:bookmarkStart w:id="9" w:name="_Toc1270592752"/>
+      <w:bookmarkStart w:id="10" w:name="_Toc182799226"/>
       <w:r>
         <w:rPr>
           <w:rFonts w:hint="default"/>
@@ -1448,6 +1448,7 @@
   </w:style>
   <w:style w:type="paragraph" w:styleId="17">
     <w:name w:val="Body Text First Indent 2"/>
+    <w:basedOn w:val="1"/>
     <w:link w:val="26"/>
     <w:qFormat/>
     <w:uiPriority w:val="99"/>
@@ -1455,7 +1456,7 @@
       <w:ind w:left="0" w:leftChars="0" w:firstLine="640" w:firstLineChars="200"/>
     </w:pPr>
     <w:rPr>
-      <w:rFonts w:ascii="仿宋_GB2312" w:hAnsi="仿宋_GB2312" w:eastAsia="仿宋_GB2312" w:cs="Calibri"/>
+      <w:rFonts w:cs="Calibri"/>
       <w:szCs w:val="21"/>
     </w:rPr>
   </w:style>

</xml_diff>